<commit_message>
Updated sale of Training course functional specifications
Added use cases diagram in functional specifications.
</commit_message>
<xml_diff>
--- a/doc/functional_specifications/functionalSpecifications.docx
+++ b/doc/functional_specifications/functionalSpecifications.docx
@@ -42,9 +42,6 @@
     <w:p>
       <w:pPr>
         <w:pStyle w:val="Normal"/>
-        <w:rPr>
-          <w:u w:val="single"/>
-        </w:rPr>
       </w:pPr>
       <w:r>
         <w:rPr>
@@ -56,11 +53,78 @@
     <w:p>
       <w:pPr>
         <w:pStyle w:val="Normal"/>
+        <w:rPr>
+          <w:u w:val="single"/>
+        </w:rPr>
+      </w:pPr>
+    </w:p>
+    <w:p>
+      <w:pPr>
+        <w:pStyle w:val="Normal"/>
       </w:pPr>
       <w:r>
         <w:rPr/>
         <w:t xml:space="preserve">                                  </w:t>
       </w:r>
+      <w:r>
+        <w:drawing>
+          <wp:inline wp14:editId="4AEBE3DD" wp14:anchorId="0004901E">
+            <wp:extent cx="4219575" cy="5724525"/>
+            <wp:effectExtent l="0" t="0" r="0" b="0"/>
+            <wp:docPr id="1821506972" name="drawing"/>
+            <wp:cNvGraphicFramePr>
+              <a:graphicFrameLocks noChangeAspect="1"/>
+            </wp:cNvGraphicFramePr>
+            <a:graphic>
+              <a:graphicData xmlns:a="http://schemas.openxmlformats.org/drawingml/2006/main" uri="http://schemas.openxmlformats.org/drawingml/2006/picture">
+                <pic:pic xmlns:pic="http://schemas.openxmlformats.org/drawingml/2006/picture">
+                  <pic:nvPicPr>
+                    <pic:cNvPr id="1821506972" name="Picture 1821506972"/>
+                    <pic:cNvPicPr/>
+                  </pic:nvPicPr>
+                  <pic:blipFill>
+                    <a:blip xmlns:r="http://schemas.openxmlformats.org/officeDocument/2006/relationships" r:embed="rId690780764">
+                      <a:extLst>
+                        <a:ext uri="{28A0092B-C50C-407E-A947-70E740481C1C}">
+                          <a14:useLocalDpi xmlns:a14="http://schemas.microsoft.com/office/drawing/2010/main"/>
+                        </a:ext>
+                      </a:extLst>
+                    </a:blip>
+                    <a:stretch>
+                      <a:fillRect/>
+                    </a:stretch>
+                  </pic:blipFill>
+                  <pic:spPr>
+                    <a:xfrm>
+                      <a:off x="0" y="0"/>
+                      <a:ext cx="4219575" cy="5724525"/>
+                    </a:xfrm>
+                    <a:prstGeom prst="rect">
+                      <a:avLst/>
+                    </a:prstGeom>
+                  </pic:spPr>
+                </pic:pic>
+              </a:graphicData>
+            </a:graphic>
+          </wp:inline>
+        </w:drawing>
+      </w:r>
+    </w:p>
+    <w:p>
+      <w:pPr>
+        <w:pStyle w:val="Normal"/>
+        <w:rPr>
+          <w:u w:val="single"/>
+        </w:rPr>
+      </w:pPr>
+    </w:p>
+    <w:p>
+      <w:pPr>
+        <w:pStyle w:val="Normal"/>
+        <w:rPr>
+          <w:u w:val="single"/>
+        </w:rPr>
+      </w:pPr>
     </w:p>
     <w:p>
       <w:pPr>
@@ -910,36 +974,6 @@
     <w:p>
       <w:pPr>
         <w:pStyle w:val="Normal"/>
-        <w:suppressLineNumbers w:val="0"/>
-        <w:bidi w:val="0"/>
-        <w:spacing w:before="0" w:beforeAutospacing="off" w:after="160" w:afterAutospacing="off" w:line="279" w:lineRule="auto"/>
-        <w:ind w:left="0" w:right="0"/>
-        <w:jc w:val="left"/>
-      </w:pPr>
-    </w:p>
-    <w:p>
-      <w:pPr>
-        <w:pStyle w:val="Normal"/>
-        <w:suppressLineNumbers w:val="0"/>
-        <w:bidi w:val="0"/>
-        <w:spacing w:before="0" w:beforeAutospacing="off" w:after="160" w:afterAutospacing="off" w:line="279" w:lineRule="auto"/>
-        <w:ind w:left="0" w:right="0"/>
-        <w:jc w:val="left"/>
-      </w:pPr>
-    </w:p>
-    <w:p>
-      <w:pPr>
-        <w:pStyle w:val="Normal"/>
-        <w:suppressLineNumbers w:val="0"/>
-        <w:bidi w:val="0"/>
-        <w:spacing w:before="0" w:beforeAutospacing="off" w:after="160" w:afterAutospacing="off" w:line="279" w:lineRule="auto"/>
-        <w:ind w:left="0" w:right="0"/>
-        <w:jc w:val="left"/>
-      </w:pPr>
-    </w:p>
-    <w:p>
-      <w:pPr>
-        <w:pStyle w:val="Normal"/>
       </w:pPr>
       <w:r>
         <w:rPr/>
@@ -952,7 +986,7 @@
       </w:pPr>
       <w:r>
         <w:drawing>
-          <wp:inline wp14:editId="64BFE38A" wp14:anchorId="32487819">
+          <wp:inline wp14:editId="5D02840A" wp14:anchorId="32487819">
             <wp:extent cx="3552825" cy="5724525"/>
             <wp:effectExtent l="0" t="0" r="0" b="0"/>
             <wp:docPr id="1547819118" name="drawing"/>

</xml_diff>

<commit_message>
Updated functional specification on class diagram
</commit_message>
<xml_diff>
--- a/doc/functional_specifications/functionalSpecifications.docx
+++ b/doc/functional_specifications/functionalSpecifications.docx
@@ -986,10 +986,10 @@
       </w:pPr>
       <w:r>
         <w:drawing>
-          <wp:inline wp14:editId="5D02840A" wp14:anchorId="32487819">
-            <wp:extent cx="3552825" cy="5724525"/>
+          <wp:inline wp14:editId="6E807C0F" wp14:anchorId="4FBEFB9D">
+            <wp:extent cx="3524250" cy="5724525"/>
             <wp:effectExtent l="0" t="0" r="0" b="0"/>
-            <wp:docPr id="1547819118" name="drawing"/>
+            <wp:docPr id="1844510983" name="drawing"/>
             <wp:cNvGraphicFramePr>
               <a:graphicFrameLocks noChangeAspect="1"/>
             </wp:cNvGraphicFramePr>
@@ -997,11 +997,11 @@
               <a:graphicData xmlns:a="http://schemas.openxmlformats.org/drawingml/2006/main" uri="http://schemas.openxmlformats.org/drawingml/2006/picture">
                 <pic:pic xmlns:pic="http://schemas.openxmlformats.org/drawingml/2006/picture">
                   <pic:nvPicPr>
-                    <pic:cNvPr id="1018285527" name="Picture 1018285527"/>
+                    <pic:cNvPr id="1844510983" name="Picture 1844510983"/>
                     <pic:cNvPicPr/>
                   </pic:nvPicPr>
                   <pic:blipFill>
-                    <a:blip xmlns:r="http://schemas.openxmlformats.org/officeDocument/2006/relationships" r:embed="rId1843915847">
+                    <a:blip xmlns:r="http://schemas.openxmlformats.org/officeDocument/2006/relationships" r:embed="rId535610734">
                       <a:extLst>
                         <a:ext uri="{28A0092B-C50C-407E-A947-70E740481C1C}">
                           <a14:useLocalDpi xmlns:a14="http://schemas.microsoft.com/office/drawing/2010/main"/>
@@ -1015,7 +1015,7 @@
                   <pic:spPr>
                     <a:xfrm>
                       <a:off x="0" y="0"/>
-                      <a:ext cx="3552825" cy="5724525"/>
+                      <a:ext cx="3524250" cy="5724525"/>
                     </a:xfrm>
                     <a:prstGeom prst="rect">
                       <a:avLst/>

</xml_diff>